<commit_message>
Atualiza Anexo C: tabela de pagamento vigente e efetivo de 195 PMs
Co-Authored-By: Claude Opus 5.5 <noreply@anthropic.com>
Claude-Session: https://claude.ai/code/session_01Sahi55126JzsF8DB6DZ3fC
</commit_message>
<xml_diff>
--- a/out/PLANO_DE_OPERACOES_N_001-2026_Operacao_Verao_2026-2027.docx
+++ b/out/PLANO_DE_OPERACOES_N_001-2026_Operacao_Verao_2026-2027.docx
@@ -2351,7 +2351,7 @@
           <w:sz w:val="20"/>
           <w:szCs w:val="20"/>
         </w:rPr>
-        <w:t>Tal período representa 69 dias entre fins de semana e feriados, totalizando 200 policiais militares escalados;</w:t>
+        <w:t>Tal período representa 69 dias entre fins de semana e feriados, totalizando 195 policiais militares escalados;</w:t>
       </w:r>
     </w:p>
     <w:p>
@@ -5632,7 +5632,7 @@
                 <w:sz w:val="20"/>
                 <w:szCs w:val="20"/>
               </w:rPr>
-              <w:t xml:space="preserve">       120,21 </w:t>
+              <w:t xml:space="preserve">       130,46 </w:t>
             </w:r>
           </w:p>
         </w:tc>
@@ -5733,7 +5733,7 @@
                 <w:sz w:val="20"/>
                 <w:szCs w:val="20"/>
               </w:rPr>
-              <w:t xml:space="preserve">         60,10 </w:t>
+              <w:t xml:space="preserve">         65,23 </w:t>
             </w:r>
           </w:p>
         </w:tc>
@@ -5967,7 +5967,7 @@
                 <w:sz w:val="20"/>
                 <w:szCs w:val="20"/>
               </w:rPr>
-              <w:t xml:space="preserve">       109,42 </w:t>
+              <w:t xml:space="preserve">       118,70 </w:t>
             </w:r>
           </w:p>
         </w:tc>
@@ -6068,7 +6068,7 @@
                 <w:sz w:val="20"/>
                 <w:szCs w:val="20"/>
               </w:rPr>
-              <w:t xml:space="preserve">         54,71 </w:t>
+              <w:t xml:space="preserve">         59,35 </w:t>
             </w:r>
           </w:p>
         </w:tc>
@@ -6302,7 +6302,7 @@
                 <w:sz w:val="20"/>
                 <w:szCs w:val="20"/>
               </w:rPr>
-              <w:t xml:space="preserve">       100,68 </w:t>
+              <w:t xml:space="preserve">       109,17 </w:t>
             </w:r>
           </w:p>
         </w:tc>
@@ -6403,7 +6403,7 @@
                 <w:sz w:val="20"/>
                 <w:szCs w:val="20"/>
               </w:rPr>
-              <w:t xml:space="preserve">         50,34 </w:t>
+              <w:t xml:space="preserve">         54,59 </w:t>
             </w:r>
           </w:p>
         </w:tc>
@@ -6637,7 +6637,7 @@
                 <w:sz w:val="20"/>
                 <w:szCs w:val="20"/>
               </w:rPr>
-              <w:t xml:space="preserve">         83,04 </w:t>
+              <w:t xml:space="preserve">         89,95 </w:t>
             </w:r>
           </w:p>
         </w:tc>
@@ -6738,7 +6738,7 @@
                 <w:sz w:val="20"/>
                 <w:szCs w:val="20"/>
               </w:rPr>
-              <w:t xml:space="preserve">         41,52 </w:t>
+              <w:t xml:space="preserve">         44,98 </w:t>
             </w:r>
           </w:p>
         </w:tc>
@@ -6972,7 +6972,7 @@
                 <w:sz w:val="20"/>
                 <w:szCs w:val="20"/>
               </w:rPr>
-              <w:t xml:space="preserve">         69,56 </w:t>
+              <w:t xml:space="preserve">         75,36 </w:t>
             </w:r>
           </w:p>
         </w:tc>
@@ -7073,7 +7073,7 @@
                 <w:sz w:val="20"/>
                 <w:szCs w:val="20"/>
               </w:rPr>
-              <w:t xml:space="preserve">         34,78 </w:t>
+              <w:t xml:space="preserve">         37,68 </w:t>
             </w:r>
           </w:p>
         </w:tc>
@@ -7307,7 +7307,7 @@
                 <w:sz w:val="20"/>
                 <w:szCs w:val="20"/>
               </w:rPr>
-              <w:t xml:space="preserve">         42,88 </w:t>
+              <w:t xml:space="preserve">         45,25 </w:t>
             </w:r>
           </w:p>
         </w:tc>
@@ -7408,7 +7408,7 @@
                 <w:sz w:val="20"/>
                 <w:szCs w:val="20"/>
               </w:rPr>
-              <w:t xml:space="preserve">         21,44 </w:t>
+              <w:t xml:space="preserve">         22,63 </w:t>
             </w:r>
           </w:p>
         </w:tc>
@@ -7642,7 +7642,7 @@
                 <w:sz w:val="20"/>
                 <w:szCs w:val="20"/>
               </w:rPr>
-              <w:t xml:space="preserve">         42,11 </w:t>
+              <w:t xml:space="preserve">         44,44 </w:t>
             </w:r>
           </w:p>
         </w:tc>
@@ -7743,7 +7743,7 @@
                 <w:sz w:val="20"/>
                 <w:szCs w:val="20"/>
               </w:rPr>
-              <w:t xml:space="preserve">         21,06 </w:t>
+              <w:t xml:space="preserve">         22,22 </w:t>
             </w:r>
           </w:p>
         </w:tc>
@@ -7978,7 +7978,7 @@
                 <w:sz w:val="20"/>
                 <w:szCs w:val="20"/>
               </w:rPr>
-              <w:t xml:space="preserve">         39,24 </w:t>
+              <w:t xml:space="preserve">         41,18 </w:t>
             </w:r>
           </w:p>
         </w:tc>
@@ -8046,7 +8046,7 @@
                 <w:sz w:val="22"/>
                 <w:szCs w:val="22"/>
               </w:rPr>
-              <w:t>7.063,90</w:t>
+              <w:t>7.412,40</w:t>
             </w:r>
           </w:p>
         </w:tc>
@@ -8079,7 +8079,7 @@
                 <w:sz w:val="20"/>
                 <w:szCs w:val="20"/>
               </w:rPr>
-              <w:t xml:space="preserve">         19,62 </w:t>
+              <w:t xml:space="preserve">         20,59 </w:t>
             </w:r>
           </w:p>
         </w:tc>
@@ -8184,7 +8184,7 @@
                 <w:sz w:val="22"/>
                 <w:szCs w:val="22"/>
               </w:rPr>
-              <w:t>7.063,90</w:t>
+              <w:t>7.412,40</w:t>
             </w:r>
           </w:p>
         </w:tc>
@@ -8314,7 +8314,7 @@
                 <w:sz w:val="20"/>
                 <w:szCs w:val="20"/>
               </w:rPr>
-              <w:t xml:space="preserve">         36,19 </w:t>
+              <w:t xml:space="preserve">         37,71 </w:t>
             </w:r>
           </w:p>
         </w:tc>
@@ -8382,7 +8382,7 @@
                 <w:sz w:val="22"/>
                 <w:szCs w:val="22"/>
               </w:rPr>
-              <w:t>10.855,91</w:t>
+              <w:t>11.313,00</w:t>
             </w:r>
           </w:p>
         </w:tc>
@@ -8415,7 +8415,7 @@
                 <w:sz w:val="20"/>
                 <w:szCs w:val="20"/>
               </w:rPr>
-              <w:t xml:space="preserve">         18,09 </w:t>
+              <w:t xml:space="preserve">         18,86 </w:t>
             </w:r>
           </w:p>
         </w:tc>
@@ -8520,7 +8520,7 @@
                 <w:sz w:val="22"/>
                 <w:szCs w:val="22"/>
               </w:rPr>
-              <w:t>10.855,91</w:t>
+              <w:t>11.313,00</w:t>
             </w:r>
           </w:p>
         </w:tc>
@@ -8617,7 +8617,7 @@
                 <w:sz w:val="20"/>
                 <w:szCs w:val="20"/>
               </w:rPr>
-              <w:t>120</w:t>
+              <w:t>115</w:t>
             </w:r>
           </w:p>
         </w:tc>
@@ -8650,7 +8650,7 @@
                 <w:sz w:val="20"/>
                 <w:szCs w:val="20"/>
               </w:rPr>
-              <w:t xml:space="preserve">         34,14 </w:t>
+              <w:t xml:space="preserve">         35,39 </w:t>
             </w:r>
           </w:p>
         </w:tc>
@@ -8718,7 +8718,7 @@
                 <w:sz w:val="22"/>
                 <w:szCs w:val="22"/>
               </w:rPr>
-              <w:t>24.580,96</w:t>
+              <w:t>24.419,10</w:t>
             </w:r>
           </w:p>
         </w:tc>
@@ -8751,7 +8751,7 @@
                 <w:sz w:val="20"/>
                 <w:szCs w:val="20"/>
               </w:rPr>
-              <w:t xml:space="preserve">         17,07 </w:t>
+              <w:t xml:space="preserve">         17,70 </w:t>
             </w:r>
           </w:p>
         </w:tc>
@@ -8856,7 +8856,7 @@
                 <w:sz w:val="22"/>
                 <w:szCs w:val="22"/>
               </w:rPr>
-              <w:t>24.580,96</w:t>
+              <w:t>24.419,10</w:t>
             </w:r>
           </w:p>
         </w:tc>
@@ -8959,7 +8959,7 @@
                 <w:sz w:val="20"/>
                 <w:szCs w:val="20"/>
               </w:rPr>
-              <w:t>200</w:t>
+              <w:t>195</w:t>
             </w:r>
           </w:p>
         </w:tc>
@@ -9033,7 +9033,7 @@
                 <w:sz w:val="20"/>
                 <w:szCs w:val="20"/>
               </w:rPr>
-              <w:t>1200</w:t>
+              <w:t>1170</w:t>
             </w:r>
           </w:p>
         </w:tc>
@@ -9070,7 +9070,7 @@
                 <w:sz w:val="20"/>
                 <w:szCs w:val="20"/>
               </w:rPr>
-              <w:t>42.500,78</w:t>
+              <w:t>43.144,50</w:t>
             </w:r>
           </w:p>
         </w:tc>
@@ -9218,7 +9218,7 @@
                 <w:sz w:val="20"/>
                 <w:szCs w:val="20"/>
               </w:rPr>
-              <w:t>42.500,78</w:t>
+              <w:t>43.144,50</w:t>
             </w:r>
           </w:p>
         </w:tc>
@@ -9785,7 +9785,7 @@
                 <w:sz w:val="22"/>
                 <w:szCs w:val="22"/>
               </w:rPr>
-              <w:t>R$ 42.500,78</w:t>
+              <w:t>R$ 43.144,50</w:t>
             </w:r>
           </w:p>
         </w:tc>

</xml_diff>

<commit_message>
Anexo C: custo recalculado em VD diurno
Co-Authored-By: Claude Opus 5.5 <noreply@anthropic.com>
Claude-Session: https://claude.ai/code/session_01Sahi55126JzsF8DB6DZ3fC
</commit_message>
<xml_diff>
--- a/out/PLANO_DE_OPERACOES_N_001-2026_Operacao_Verao_2026-2027.docx
+++ b/out/PLANO_DE_OPERACOES_N_001-2026_Operacao_Verao_2026-2027.docx
@@ -4751,7 +4751,7 @@
                 <w:sz w:val="22"/>
                 <w:szCs w:val="22"/>
               </w:rPr>
-              <w:t>PLANILHA DE CUSTO COM GASTOS DE HORAS EXTRAS E ADICIONAIS NOTURNOS</w:t>
+              <w:t>PLANILHA DE CUSTO COM GASTOS DE VD (DIURNO E NOTURNO)</w:t>
             </w:r>
           </w:p>
         </w:tc>
@@ -5281,7 +5281,7 @@
                 <w:sz w:val="20"/>
                 <w:szCs w:val="20"/>
               </w:rPr>
-              <w:t>VL - HE</w:t>
+              <w:t>VL - VDD</w:t>
             </w:r>
           </w:p>
         </w:tc>
@@ -5318,7 +5318,7 @@
                 <w:sz w:val="20"/>
                 <w:szCs w:val="20"/>
               </w:rPr>
-              <w:t>QUANT-HE</w:t>
+              <w:t>QUANT-VDD</w:t>
             </w:r>
           </w:p>
         </w:tc>
@@ -5355,7 +5355,7 @@
                 <w:sz w:val="20"/>
                 <w:szCs w:val="20"/>
               </w:rPr>
-              <w:t>VL/HE - R$</w:t>
+              <w:t>VL/VDD - R$</w:t>
             </w:r>
           </w:p>
         </w:tc>
@@ -5392,7 +5392,7 @@
                 <w:sz w:val="20"/>
                 <w:szCs w:val="20"/>
               </w:rPr>
-              <w:t xml:space="preserve">VL - AN </w:t>
+              <w:t xml:space="preserve">VL - VDN </w:t>
             </w:r>
           </w:p>
         </w:tc>
@@ -5429,7 +5429,7 @@
                 <w:sz w:val="20"/>
                 <w:szCs w:val="20"/>
               </w:rPr>
-              <w:t xml:space="preserve">QUANT-AN </w:t>
+              <w:t xml:space="preserve">QUANT-VDN </w:t>
             </w:r>
           </w:p>
         </w:tc>
@@ -5466,7 +5466,7 @@
                 <w:sz w:val="20"/>
                 <w:szCs w:val="20"/>
               </w:rPr>
-              <w:t>VL/AN - R$</w:t>
+              <w:t>VL/VDN - R$</w:t>
             </w:r>
           </w:p>
         </w:tc>
@@ -5632,7 +5632,7 @@
                 <w:sz w:val="20"/>
                 <w:szCs w:val="20"/>
               </w:rPr>
-              <w:t xml:space="preserve">       130,46 </w:t>
+              <w:t xml:space="preserve">       70,83 </w:t>
             </w:r>
           </w:p>
         </w:tc>
@@ -5733,7 +5733,7 @@
                 <w:sz w:val="20"/>
                 <w:szCs w:val="20"/>
               </w:rPr>
-              <w:t xml:space="preserve">         65,23 </w:t>
+              <w:t xml:space="preserve">         84,95 </w:t>
             </w:r>
           </w:p>
         </w:tc>
@@ -5967,7 +5967,7 @@
                 <w:sz w:val="20"/>
                 <w:szCs w:val="20"/>
               </w:rPr>
-              <w:t xml:space="preserve">       118,70 </w:t>
+              <w:t xml:space="preserve">       68,95 </w:t>
             </w:r>
           </w:p>
         </w:tc>
@@ -6068,7 +6068,7 @@
                 <w:sz w:val="20"/>
                 <w:szCs w:val="20"/>
               </w:rPr>
-              <w:t xml:space="preserve">         59,35 </w:t>
+              <w:t xml:space="preserve">         82,71 </w:t>
             </w:r>
           </w:p>
         </w:tc>
@@ -6302,7 +6302,7 @@
                 <w:sz w:val="20"/>
                 <w:szCs w:val="20"/>
               </w:rPr>
-              <w:t xml:space="preserve">       109,17 </w:t>
+              <w:t xml:space="preserve">       68,36 </w:t>
             </w:r>
           </w:p>
         </w:tc>
@@ -6403,7 +6403,7 @@
                 <w:sz w:val="20"/>
                 <w:szCs w:val="20"/>
               </w:rPr>
-              <w:t xml:space="preserve">         54,59 </w:t>
+              <w:t xml:space="preserve">         82,01 </w:t>
             </w:r>
           </w:p>
         </w:tc>
@@ -6637,7 +6637,7 @@
                 <w:sz w:val="20"/>
                 <w:szCs w:val="20"/>
               </w:rPr>
-              <w:t xml:space="preserve">         89,95 </w:t>
+              <w:t xml:space="preserve">         68,19 </w:t>
             </w:r>
           </w:p>
         </w:tc>
@@ -6738,7 +6738,7 @@
                 <w:sz w:val="20"/>
                 <w:szCs w:val="20"/>
               </w:rPr>
-              <w:t xml:space="preserve">         44,98 </w:t>
+              <w:t xml:space="preserve">         81,74 </w:t>
             </w:r>
           </w:p>
         </w:tc>
@@ -6972,7 +6972,7 @@
                 <w:sz w:val="20"/>
                 <w:szCs w:val="20"/>
               </w:rPr>
-              <w:t xml:space="preserve">         75,36 </w:t>
+              <w:t xml:space="preserve">         67,66 </w:t>
             </w:r>
           </w:p>
         </w:tc>
@@ -7073,7 +7073,7 @@
                 <w:sz w:val="20"/>
                 <w:szCs w:val="20"/>
               </w:rPr>
-              <w:t xml:space="preserve">         37,68 </w:t>
+              <w:t xml:space="preserve">         81,18 </w:t>
             </w:r>
           </w:p>
         </w:tc>
@@ -7307,7 +7307,7 @@
                 <w:sz w:val="20"/>
                 <w:szCs w:val="20"/>
               </w:rPr>
-              <w:t xml:space="preserve">         45,25 </w:t>
+              <w:t xml:space="preserve">         47,08 </w:t>
             </w:r>
           </w:p>
         </w:tc>
@@ -7408,7 +7408,7 @@
                 <w:sz w:val="20"/>
                 <w:szCs w:val="20"/>
               </w:rPr>
-              <w:t xml:space="preserve">         22,63 </w:t>
+              <w:t xml:space="preserve">         56,49 </w:t>
             </w:r>
           </w:p>
         </w:tc>
@@ -7642,7 +7642,7 @@
                 <w:sz w:val="20"/>
                 <w:szCs w:val="20"/>
               </w:rPr>
-              <w:t xml:space="preserve">         44,44 </w:t>
+              <w:t xml:space="preserve">         35,27 </w:t>
             </w:r>
           </w:p>
         </w:tc>
@@ -7743,7 +7743,7 @@
                 <w:sz w:val="20"/>
                 <w:szCs w:val="20"/>
               </w:rPr>
-              <w:t xml:space="preserve">         22,22 </w:t>
+              <w:t xml:space="preserve">         42,34 </w:t>
             </w:r>
           </w:p>
         </w:tc>
@@ -7978,7 +7978,7 @@
                 <w:sz w:val="20"/>
                 <w:szCs w:val="20"/>
               </w:rPr>
-              <w:t xml:space="preserve">         41,18 </w:t>
+              <w:t xml:space="preserve">         30,61 </w:t>
             </w:r>
           </w:p>
         </w:tc>
@@ -8046,7 +8046,7 @@
                 <w:sz w:val="22"/>
                 <w:szCs w:val="22"/>
               </w:rPr>
-              <w:t>7.412,40</w:t>
+              <w:t>5.509,80</w:t>
             </w:r>
           </w:p>
         </w:tc>
@@ -8079,7 +8079,7 @@
                 <w:sz w:val="20"/>
                 <w:szCs w:val="20"/>
               </w:rPr>
-              <w:t xml:space="preserve">         20,59 </w:t>
+              <w:t xml:space="preserve">         36,97 </w:t>
             </w:r>
           </w:p>
         </w:tc>
@@ -8184,7 +8184,7 @@
                 <w:sz w:val="22"/>
                 <w:szCs w:val="22"/>
               </w:rPr>
-              <w:t>7.412,40</w:t>
+              <w:t>5.509,80</w:t>
             </w:r>
           </w:p>
         </w:tc>
@@ -8314,7 +8314,7 @@
                 <w:sz w:val="20"/>
                 <w:szCs w:val="20"/>
               </w:rPr>
-              <w:t xml:space="preserve">         37,71 </w:t>
+              <w:t xml:space="preserve">         29,22 </w:t>
             </w:r>
           </w:p>
         </w:tc>
@@ -8382,7 +8382,7 @@
                 <w:sz w:val="22"/>
                 <w:szCs w:val="22"/>
               </w:rPr>
-              <w:t>11.313,00</w:t>
+              <w:t>8.766,00</w:t>
             </w:r>
           </w:p>
         </w:tc>
@@ -8415,7 +8415,7 @@
                 <w:sz w:val="20"/>
                 <w:szCs w:val="20"/>
               </w:rPr>
-              <w:t xml:space="preserve">         18,86 </w:t>
+              <w:t xml:space="preserve">         35,27 </w:t>
             </w:r>
           </w:p>
         </w:tc>
@@ -8520,7 +8520,7 @@
                 <w:sz w:val="22"/>
                 <w:szCs w:val="22"/>
               </w:rPr>
-              <w:t>11.313,00</w:t>
+              <w:t>8.766,00</w:t>
             </w:r>
           </w:p>
         </w:tc>
@@ -8650,7 +8650,7 @@
                 <w:sz w:val="20"/>
                 <w:szCs w:val="20"/>
               </w:rPr>
-              <w:t xml:space="preserve">         35,39 </w:t>
+              <w:t xml:space="preserve">         27,86 </w:t>
             </w:r>
           </w:p>
         </w:tc>
@@ -8718,7 +8718,7 @@
                 <w:sz w:val="22"/>
                 <w:szCs w:val="22"/>
               </w:rPr>
-              <w:t>24.419,10</w:t>
+              <w:t>19.223,40</w:t>
             </w:r>
           </w:p>
         </w:tc>
@@ -8751,7 +8751,7 @@
                 <w:sz w:val="20"/>
                 <w:szCs w:val="20"/>
               </w:rPr>
-              <w:t xml:space="preserve">         17,70 </w:t>
+              <w:t xml:space="preserve">         33,67 </w:t>
             </w:r>
           </w:p>
         </w:tc>
@@ -8856,7 +8856,7 @@
                 <w:sz w:val="22"/>
                 <w:szCs w:val="22"/>
               </w:rPr>
-              <w:t>24.419,10</w:t>
+              <w:t>19.223,40</w:t>
             </w:r>
           </w:p>
         </w:tc>
@@ -9070,7 +9070,7 @@
                 <w:sz w:val="20"/>
                 <w:szCs w:val="20"/>
               </w:rPr>
-              <w:t>43.144,50</w:t>
+              <w:t>33.499,20</w:t>
             </w:r>
           </w:p>
         </w:tc>
@@ -9218,7 +9218,7 @@
                 <w:sz w:val="20"/>
                 <w:szCs w:val="20"/>
               </w:rPr>
-              <w:t>43.144,50</w:t>
+              <w:t>33.499,20</w:t>
             </w:r>
           </w:p>
         </w:tc>
@@ -9785,7 +9785,7 @@
                 <w:sz w:val="22"/>
                 <w:szCs w:val="22"/>
               </w:rPr>
-              <w:t>R$ 43.144,50</w:t>
+              <w:t>R$ 33.499,20</w:t>
             </w:r>
           </w:p>
         </w:tc>

</xml_diff>

<commit_message>
Anexo C: 72 dias, 288 PMs, total R$ 49.917,60
Co-Authored-By: Claude Opus 5.5 <noreply@anthropic.com>
Claude-Session: https://claude.ai/code/session_01Sahi55126JzsF8DB6DZ3fC
</commit_message>
<xml_diff>
--- a/out/PLANO_DE_OPERACOES_N_001-2026_Operacao_Verao_2026-2027.docx
+++ b/out/PLANO_DE_OPERACOES_N_001-2026_Operacao_Verao_2026-2027.docx
@@ -2351,7 +2351,7 @@
           <w:sz w:val="20"/>
           <w:szCs w:val="20"/>
         </w:rPr>
-        <w:t>Tal período representa 69 dias entre fins de semana e feriados, totalizando 195 policiais militares escalados;</w:t>
+        <w:t>Tal período representa 72 dias entre fins de semana, feriados e pontos facultativos, totalizando 288 policiais militares escalados;</w:t>
       </w:r>
     </w:p>
     <w:p>
@@ -7945,7 +7945,7 @@
                 <w:sz w:val="20"/>
                 <w:szCs w:val="20"/>
               </w:rPr>
-              <w:t>30</w:t>
+              <w:t>72</w:t>
             </w:r>
           </w:p>
         </w:tc>
@@ -8046,7 +8046,7 @@
                 <w:sz w:val="22"/>
                 <w:szCs w:val="22"/>
               </w:rPr>
-              <w:t>5.509,80</w:t>
+              <w:t>13.223,52</w:t>
             </w:r>
           </w:p>
         </w:tc>
@@ -8184,7 +8184,7 @@
                 <w:sz w:val="22"/>
                 <w:szCs w:val="22"/>
               </w:rPr>
-              <w:t>5.509,80</w:t>
+              <w:t>13.223,52</w:t>
             </w:r>
           </w:p>
         </w:tc>
@@ -8281,7 +8281,7 @@
                 <w:sz w:val="20"/>
                 <w:szCs w:val="20"/>
               </w:rPr>
-              <w:t>50</w:t>
+              <w:t>72</w:t>
             </w:r>
           </w:p>
         </w:tc>
@@ -8382,7 +8382,7 @@
                 <w:sz w:val="22"/>
                 <w:szCs w:val="22"/>
               </w:rPr>
-              <w:t>8.766,00</w:t>
+              <w:t>12.623,04</w:t>
             </w:r>
           </w:p>
         </w:tc>
@@ -8520,7 +8520,7 @@
                 <w:sz w:val="22"/>
                 <w:szCs w:val="22"/>
               </w:rPr>
-              <w:t>8.766,00</w:t>
+              <w:t>12.623,04</w:t>
             </w:r>
           </w:p>
         </w:tc>
@@ -8617,7 +8617,7 @@
                 <w:sz w:val="20"/>
                 <w:szCs w:val="20"/>
               </w:rPr>
-              <w:t>115</w:t>
+              <w:t>144</w:t>
             </w:r>
           </w:p>
         </w:tc>
@@ -8718,7 +8718,7 @@
                 <w:sz w:val="22"/>
                 <w:szCs w:val="22"/>
               </w:rPr>
-              <w:t>19.223,40</w:t>
+              <w:t>24.071,04</w:t>
             </w:r>
           </w:p>
         </w:tc>
@@ -8856,7 +8856,7 @@
                 <w:sz w:val="22"/>
                 <w:szCs w:val="22"/>
               </w:rPr>
-              <w:t>19.223,40</w:t>
+              <w:t>24.071,04</w:t>
             </w:r>
           </w:p>
         </w:tc>
@@ -8959,7 +8959,7 @@
                 <w:sz w:val="20"/>
                 <w:szCs w:val="20"/>
               </w:rPr>
-              <w:t>195</w:t>
+              <w:t>288</w:t>
             </w:r>
           </w:p>
         </w:tc>
@@ -9033,7 +9033,7 @@
                 <w:sz w:val="20"/>
                 <w:szCs w:val="20"/>
               </w:rPr>
-              <w:t>1170</w:t>
+              <w:t>1728</w:t>
             </w:r>
           </w:p>
         </w:tc>
@@ -9070,7 +9070,7 @@
                 <w:sz w:val="20"/>
                 <w:szCs w:val="20"/>
               </w:rPr>
-              <w:t>33.499,20</w:t>
+              <w:t>49.917,60</w:t>
             </w:r>
           </w:p>
         </w:tc>
@@ -9218,7 +9218,7 @@
                 <w:sz w:val="20"/>
                 <w:szCs w:val="20"/>
               </w:rPr>
-              <w:t>33.499,20</w:t>
+              <w:t>49.917,60</w:t>
             </w:r>
           </w:p>
         </w:tc>
@@ -9539,7 +9539,7 @@
                 <w:sz w:val="22"/>
                 <w:szCs w:val="22"/>
               </w:rPr>
-              <w:t>69</w:t>
+              <w:t>72</w:t>
             </w:r>
           </w:p>
         </w:tc>
@@ -9785,7 +9785,7 @@
                 <w:sz w:val="22"/>
                 <w:szCs w:val="22"/>
               </w:rPr>
-              <w:t>R$ 33.499,20</w:t>
+              <w:t>R$ 49.917,60</w:t>
             </w:r>
           </w:p>
         </w:tc>

</xml_diff>